<commit_message>
Dokonczono zadanie z WCAG
</commit_message>
<xml_diff>
--- a/inf_zad.docx
+++ b/inf_zad.docx
@@ -13,6 +13,8 @@
           <w:szCs w:val="32"/>
         </w:rPr>
       </w:pPr>
+      <w:bookmarkStart w:id="0" w:name="_Hlk190865268"/>
+      <w:bookmarkEnd w:id="0"/>
       <w:r>
         <w:rPr>
           <w:rFonts w:ascii="Comic Sans MS" w:hAnsi="Comic Sans MS"/>
@@ -178,6 +180,7 @@
       <w:r>
         <w:rPr>
           <w:rFonts w:ascii="Comic Sans MS" w:hAnsi="Comic Sans MS"/>
+          <w:noProof/>
           <w:sz w:val="32"/>
           <w:szCs w:val="32"/>
         </w:rPr>
@@ -329,6 +332,7 @@
       <w:r>
         <w:rPr>
           <w:rFonts w:ascii="Comic Sans MS" w:hAnsi="Comic Sans MS"/>
+          <w:noProof/>
           <w:color w:val="FF0000"/>
           <w:sz w:val="24"/>
           <w:szCs w:val="24"/>
@@ -517,6 +521,7 @@
       <w:r>
         <w:rPr>
           <w:rFonts w:ascii="Comic Sans MS" w:hAnsi="Comic Sans MS"/>
+          <w:noProof/>
           <w:color w:val="FF0000"/>
           <w:sz w:val="32"/>
           <w:szCs w:val="32"/>
@@ -666,6 +671,10 @@
     <w:p>
       <w:pPr>
         <w:pStyle w:val="Akapitzlist"/>
+        <w:numPr>
+          <w:ilvl w:val="0"/>
+          <w:numId w:val="1"/>
+        </w:numPr>
         <w:jc w:val="center"/>
         <w:rPr>
           <w:rFonts w:ascii="Comic Sans MS" w:hAnsi="Comic Sans MS"/>
@@ -681,20 +690,897 @@
           <w:sz w:val="32"/>
           <w:szCs w:val="32"/>
         </w:rPr>
-        <w:t>4.</w:t>
-      </w:r>
-    </w:p>
-    <w:p>
-      <w:pPr>
-        <w:pStyle w:val="Akapitzlist"/>
-        <w:jc w:val="center"/>
-        <w:rPr>
-          <w:rFonts w:ascii="Comic Sans MS" w:hAnsi="Comic Sans MS"/>
-          <w:color w:val="538135" w:themeColor="accent6" w:themeShade="BF"/>
-          <w:sz w:val="32"/>
-          <w:szCs w:val="32"/>
-        </w:rPr>
-      </w:pPr>
+        <w:t>Nadmiarowy link</w:t>
+      </w:r>
+    </w:p>
+    <w:p>
+      <w:pPr>
+        <w:ind w:left="360"/>
+        <w:jc w:val="center"/>
+        <w:rPr>
+          <w:rFonts w:ascii="Comic Sans MS" w:hAnsi="Comic Sans MS" w:cs="Noto Sans"/>
+          <w:color w:val="FF0000"/>
+          <w:sz w:val="24"/>
+          <w:szCs w:val="24"/>
+          <w:shd w:val="clear" w:color="auto" w:fill="FFFFFF"/>
+        </w:rPr>
+      </w:pPr>
+      <w:r>
+        <w:rPr>
+          <w:rFonts w:ascii="Comic Sans MS" w:hAnsi="Comic Sans MS"/>
+          <w:color w:val="FF0000"/>
+          <w:sz w:val="24"/>
+          <w:szCs w:val="24"/>
+        </w:rPr>
+        <w:t xml:space="preserve">WCAG </w:t>
+      </w:r>
+      <w:r>
+        <w:rPr>
+          <w:rFonts w:ascii="Comic Sans MS" w:hAnsi="Comic Sans MS"/>
+          <w:color w:val="FF0000"/>
+          <w:sz w:val="24"/>
+          <w:szCs w:val="24"/>
+        </w:rPr>
+        <w:t>(2.2.4</w:t>
+      </w:r>
+      <w:r>
+        <w:rPr>
+          <w:rFonts w:ascii="Comic Sans MS" w:hAnsi="Comic Sans MS"/>
+          <w:color w:val="FF0000"/>
+          <w:sz w:val="24"/>
+          <w:szCs w:val="24"/>
+        </w:rPr>
+        <w:t xml:space="preserve">) </w:t>
+      </w:r>
+      <w:r>
+        <w:rPr>
+          <w:rFonts w:ascii="Comic Sans MS" w:hAnsi="Comic Sans MS"/>
+          <w:color w:val="FF0000"/>
+          <w:sz w:val="24"/>
+          <w:szCs w:val="24"/>
+          <w:shd w:val="clear" w:color="auto" w:fill="FFFFFF"/>
+        </w:rPr>
+        <w:t>Przerywanie pracy może być odłożone w czasie lub odrzucone przez użytkownika, chyba że jest to sytuacja wyjątkowa.</w:t>
+      </w:r>
+    </w:p>
+    <w:p>
+      <w:pPr>
+        <w:pStyle w:val="Akapitzlist"/>
+        <w:jc w:val="center"/>
+        <w:rPr>
+          <w:rFonts w:ascii="Comic Sans MS" w:hAnsi="Comic Sans MS"/>
+          <w:color w:val="000000" w:themeColor="text1"/>
+          <w:sz w:val="32"/>
+          <w:szCs w:val="32"/>
+        </w:rPr>
+      </w:pPr>
+      <w:r>
+        <w:rPr>
+          <w:rFonts w:ascii="Comic Sans MS" w:hAnsi="Comic Sans MS"/>
+          <w:color w:val="000000" w:themeColor="text1"/>
+          <w:sz w:val="32"/>
+          <w:szCs w:val="32"/>
+        </w:rPr>
+        <w:drawing>
+          <wp:inline distT="0" distB="0" distL="0" distR="0" wp14:anchorId="3BF0D285" wp14:editId="0A3C0F19">
+            <wp:extent cx="2991917" cy="1731104"/>
+            <wp:effectExtent l="0" t="0" r="0" b="2540"/>
+            <wp:docPr id="4" name="Obraz 4"/>
+            <wp:cNvGraphicFramePr>
+              <a:graphicFrameLocks xmlns:a="http://schemas.openxmlformats.org/drawingml/2006/main" noChangeAspect="1"/>
+            </wp:cNvGraphicFramePr>
+            <a:graphic xmlns:a="http://schemas.openxmlformats.org/drawingml/2006/main">
+              <a:graphicData uri="http://schemas.openxmlformats.org/drawingml/2006/picture">
+                <pic:pic xmlns:pic="http://schemas.openxmlformats.org/drawingml/2006/picture">
+                  <pic:nvPicPr>
+                    <pic:cNvPr id="1" name=""/>
+                    <pic:cNvPicPr/>
+                  </pic:nvPicPr>
+                  <pic:blipFill>
+                    <a:blip r:embed="rId8"/>
+                    <a:stretch>
+                      <a:fillRect/>
+                    </a:stretch>
+                  </pic:blipFill>
+                  <pic:spPr>
+                    <a:xfrm>
+                      <a:off x="0" y="0"/>
+                      <a:ext cx="3002062" cy="1736974"/>
+                    </a:xfrm>
+                    <a:prstGeom prst="rect">
+                      <a:avLst/>
+                    </a:prstGeom>
+                  </pic:spPr>
+                </pic:pic>
+              </a:graphicData>
+            </a:graphic>
+          </wp:inline>
+        </w:drawing>
+      </w:r>
+    </w:p>
+    <w:p>
+      <w:pPr>
+        <w:pStyle w:val="Akapitzlist"/>
+        <w:jc w:val="center"/>
+        <w:rPr>
+          <w:rFonts w:ascii="Comic Sans MS" w:hAnsi="Comic Sans MS"/>
+          <w:color w:val="538135" w:themeColor="accent6" w:themeShade="BF"/>
+          <w:sz w:val="32"/>
+          <w:szCs w:val="32"/>
+        </w:rPr>
+      </w:pPr>
+      <w:r>
+        <w:rPr>
+          <w:rFonts w:ascii="Comic Sans MS" w:hAnsi="Comic Sans MS"/>
+          <w:color w:val="538135" w:themeColor="accent6" w:themeShade="BF"/>
+          <w:sz w:val="32"/>
+          <w:szCs w:val="32"/>
+        </w:rPr>
+        <w:t>Jeśli to możliwe, połącz</w:t>
+      </w:r>
+      <w:r>
+        <w:rPr>
+          <w:rFonts w:ascii="Comic Sans MS" w:hAnsi="Comic Sans MS"/>
+          <w:color w:val="538135" w:themeColor="accent6" w:themeShade="BF"/>
+          <w:sz w:val="32"/>
+          <w:szCs w:val="32"/>
+        </w:rPr>
+        <w:t xml:space="preserve"> nadmiarowe </w:t>
+      </w:r>
+      <w:r>
+        <w:rPr>
+          <w:rFonts w:ascii="Comic Sans MS" w:hAnsi="Comic Sans MS"/>
+          <w:color w:val="538135" w:themeColor="accent6" w:themeShade="BF"/>
+          <w:sz w:val="32"/>
+          <w:szCs w:val="32"/>
+        </w:rPr>
+        <w:t>linki w jeden link i usuń zbędny tekst lub tekst alternatywny</w:t>
+      </w:r>
+    </w:p>
+    <w:p>
+      <w:pPr>
+        <w:pStyle w:val="Akapitzlist"/>
+        <w:jc w:val="center"/>
+        <w:rPr>
+          <w:rFonts w:ascii="Comic Sans MS" w:hAnsi="Comic Sans MS"/>
+          <w:color w:val="538135" w:themeColor="accent6" w:themeShade="BF"/>
+          <w:sz w:val="32"/>
+          <w:szCs w:val="32"/>
+        </w:rPr>
+      </w:pPr>
+    </w:p>
+    <w:p>
+      <w:pPr>
+        <w:pStyle w:val="Akapitzlist"/>
+        <w:jc w:val="center"/>
+        <w:rPr>
+          <w:rFonts w:ascii="Comic Sans MS" w:hAnsi="Comic Sans MS"/>
+          <w:color w:val="538135" w:themeColor="accent6" w:themeShade="BF"/>
+          <w:sz w:val="32"/>
+          <w:szCs w:val="32"/>
+        </w:rPr>
+      </w:pPr>
+    </w:p>
+    <w:p>
+      <w:pPr>
+        <w:pStyle w:val="Akapitzlist"/>
+        <w:jc w:val="center"/>
+        <w:rPr>
+          <w:rFonts w:ascii="Comic Sans MS" w:hAnsi="Comic Sans MS"/>
+          <w:color w:val="538135" w:themeColor="accent6" w:themeShade="BF"/>
+          <w:sz w:val="32"/>
+          <w:szCs w:val="32"/>
+        </w:rPr>
+      </w:pPr>
+    </w:p>
+    <w:p>
+      <w:pPr>
+        <w:pStyle w:val="Akapitzlist"/>
+        <w:jc w:val="center"/>
+        <w:rPr>
+          <w:rFonts w:ascii="Comic Sans MS" w:hAnsi="Comic Sans MS"/>
+          <w:color w:val="538135" w:themeColor="accent6" w:themeShade="BF"/>
+          <w:sz w:val="32"/>
+          <w:szCs w:val="32"/>
+        </w:rPr>
+      </w:pPr>
+    </w:p>
+    <w:p>
+      <w:pPr>
+        <w:pStyle w:val="Akapitzlist"/>
+        <w:jc w:val="center"/>
+        <w:rPr>
+          <w:rFonts w:ascii="Comic Sans MS" w:hAnsi="Comic Sans MS"/>
+          <w:color w:val="538135" w:themeColor="accent6" w:themeShade="BF"/>
+          <w:sz w:val="32"/>
+          <w:szCs w:val="32"/>
+        </w:rPr>
+      </w:pPr>
+    </w:p>
+    <w:p>
+      <w:pPr>
+        <w:jc w:val="center"/>
+        <w:rPr>
+          <w:rFonts w:ascii="Comic Sans MS" w:hAnsi="Comic Sans MS"/>
+          <w:b/>
+          <w:bCs/>
+          <w:sz w:val="32"/>
+          <w:szCs w:val="32"/>
+        </w:rPr>
+      </w:pPr>
+      <w:r>
+        <w:rPr>
+          <w:rFonts w:ascii="Comic Sans MS" w:hAnsi="Comic Sans MS"/>
+          <w:b/>
+          <w:bCs/>
+          <w:sz w:val="32"/>
+          <w:szCs w:val="32"/>
+        </w:rPr>
+        <w:lastRenderedPageBreak/>
+        <w:t>Problemy z g</w:t>
+      </w:r>
+      <w:r>
+        <w:rPr>
+          <w:rFonts w:ascii="Comic Sans MS" w:hAnsi="Comic Sans MS"/>
+          <w:b/>
+          <w:bCs/>
+          <w:sz w:val="32"/>
+          <w:szCs w:val="32"/>
+        </w:rPr>
+        <w:t>łówn</w:t>
+      </w:r>
+      <w:r>
+        <w:rPr>
+          <w:rFonts w:ascii="Comic Sans MS" w:hAnsi="Comic Sans MS"/>
+          <w:b/>
+          <w:bCs/>
+          <w:sz w:val="32"/>
+          <w:szCs w:val="32"/>
+        </w:rPr>
+        <w:t>ą</w:t>
+      </w:r>
+      <w:r>
+        <w:rPr>
+          <w:rFonts w:ascii="Comic Sans MS" w:hAnsi="Comic Sans MS"/>
+          <w:b/>
+          <w:bCs/>
+          <w:sz w:val="32"/>
+          <w:szCs w:val="32"/>
+        </w:rPr>
+        <w:t xml:space="preserve"> stron</w:t>
+      </w:r>
+      <w:r>
+        <w:rPr>
+          <w:rFonts w:ascii="Comic Sans MS" w:hAnsi="Comic Sans MS"/>
+          <w:b/>
+          <w:bCs/>
+          <w:sz w:val="32"/>
+          <w:szCs w:val="32"/>
+        </w:rPr>
+        <w:t>ą</w:t>
+      </w:r>
+      <w:r>
+        <w:rPr>
+          <w:rFonts w:ascii="Comic Sans MS" w:hAnsi="Comic Sans MS"/>
+          <w:b/>
+          <w:bCs/>
+          <w:sz w:val="32"/>
+          <w:szCs w:val="32"/>
+        </w:rPr>
+        <w:t xml:space="preserve"> </w:t>
+      </w:r>
+      <w:r>
+        <w:rPr>
+          <w:rFonts w:ascii="Comic Sans MS" w:hAnsi="Comic Sans MS"/>
+          <w:b/>
+          <w:bCs/>
+          <w:sz w:val="32"/>
+          <w:szCs w:val="32"/>
+        </w:rPr>
+        <w:t>Szczecińskiego Collegium Informatycznego</w:t>
+      </w:r>
+      <w:r>
+        <w:rPr>
+          <w:rFonts w:ascii="Comic Sans MS" w:hAnsi="Comic Sans MS"/>
+          <w:b/>
+          <w:bCs/>
+          <w:sz w:val="32"/>
+          <w:szCs w:val="32"/>
+        </w:rPr>
+        <w:t>:</w:t>
+      </w:r>
+    </w:p>
+    <w:p>
+      <w:pPr>
+        <w:pStyle w:val="Akapitzlist"/>
+        <w:numPr>
+          <w:ilvl w:val="0"/>
+          <w:numId w:val="2"/>
+        </w:numPr>
+        <w:jc w:val="center"/>
+        <w:rPr>
+          <w:rFonts w:ascii="Comic Sans MS" w:hAnsi="Comic Sans MS" w:cs="Open Sans"/>
+          <w:color w:val="000000" w:themeColor="text1"/>
+          <w:sz w:val="28"/>
+          <w:szCs w:val="28"/>
+          <w:shd w:val="clear" w:color="auto" w:fill="FFFFFF"/>
+        </w:rPr>
+      </w:pPr>
+      <w:r>
+        <w:rPr>
+          <w:rFonts w:ascii="Comic Sans MS" w:hAnsi="Comic Sans MS" w:cs="Open Sans"/>
+          <w:color w:val="000000" w:themeColor="text1"/>
+          <w:sz w:val="28"/>
+          <w:szCs w:val="28"/>
+          <w:shd w:val="clear" w:color="auto" w:fill="FFFFFF"/>
+        </w:rPr>
+        <w:t>Brakuje alternatywnego tekstu w połączonym obrazie</w:t>
+      </w:r>
+      <w:r>
+        <w:rPr>
+          <w:rFonts w:ascii="Comic Sans MS" w:hAnsi="Comic Sans MS" w:cs="Open Sans"/>
+          <w:color w:val="000000" w:themeColor="text1"/>
+          <w:sz w:val="28"/>
+          <w:szCs w:val="28"/>
+          <w:shd w:val="clear" w:color="auto" w:fill="FFFFFF"/>
+        </w:rPr>
+        <w:t xml:space="preserve"> </w:t>
+      </w:r>
+    </w:p>
+    <w:p>
+      <w:pPr>
+        <w:pStyle w:val="Akapitzlist"/>
+        <w:jc w:val="center"/>
+        <w:rPr>
+          <w:rFonts w:ascii="Comic Sans MS" w:hAnsi="Comic Sans MS" w:cs="Open Sans"/>
+          <w:color w:val="FF0000"/>
+          <w:sz w:val="28"/>
+          <w:szCs w:val="28"/>
+          <w:shd w:val="clear" w:color="auto" w:fill="FFFFFF"/>
+        </w:rPr>
+      </w:pPr>
+      <w:r>
+        <w:rPr>
+          <w:rFonts w:ascii="Comic Sans MS" w:hAnsi="Comic Sans MS" w:cs="Open Sans"/>
+          <w:color w:val="FF0000"/>
+          <w:sz w:val="24"/>
+          <w:szCs w:val="24"/>
+          <w:shd w:val="clear" w:color="auto" w:fill="FFFFFF"/>
+        </w:rPr>
+        <w:t xml:space="preserve">WCAG (1.1.1) </w:t>
+      </w:r>
+      <w:r>
+        <w:rPr>
+          <w:rFonts w:ascii="Comic Sans MS" w:hAnsi="Comic Sans MS" w:cs="Noto Sans"/>
+          <w:color w:val="FF0000"/>
+          <w:sz w:val="24"/>
+          <w:szCs w:val="24"/>
+          <w:shd w:val="clear" w:color="auto" w:fill="FFFFFF"/>
+        </w:rPr>
+        <w:t>Wszelkie treści nietekstowe przedstawione użytkownikowi posiadają swoją tekstową alternatywę, która pełni tę samą funkcję, z wyjątkiem sytuacji opisanych poniżej.</w:t>
+      </w:r>
+    </w:p>
+    <w:p>
+      <w:pPr>
+        <w:jc w:val="center"/>
+        <w:rPr>
+          <w:rFonts w:ascii="Comic Sans MS" w:hAnsi="Comic Sans MS"/>
+          <w:sz w:val="32"/>
+          <w:szCs w:val="32"/>
+        </w:rPr>
+      </w:pPr>
+      <w:r>
+        <w:rPr>
+          <w:rFonts w:ascii="Comic Sans MS" w:hAnsi="Comic Sans MS"/>
+          <w:sz w:val="32"/>
+          <w:szCs w:val="32"/>
+        </w:rPr>
+        <w:drawing>
+          <wp:inline distT="0" distB="0" distL="0" distR="0" wp14:anchorId="40CA3FF5" wp14:editId="7D5A7946">
+            <wp:extent cx="2984601" cy="1706473"/>
+            <wp:effectExtent l="0" t="0" r="6350" b="8255"/>
+            <wp:docPr id="6" name="Obraz 6"/>
+            <wp:cNvGraphicFramePr>
+              <a:graphicFrameLocks xmlns:a="http://schemas.openxmlformats.org/drawingml/2006/main" noChangeAspect="1"/>
+            </wp:cNvGraphicFramePr>
+            <a:graphic xmlns:a="http://schemas.openxmlformats.org/drawingml/2006/main">
+              <a:graphicData uri="http://schemas.openxmlformats.org/drawingml/2006/picture">
+                <pic:pic xmlns:pic="http://schemas.openxmlformats.org/drawingml/2006/picture">
+                  <pic:nvPicPr>
+                    <pic:cNvPr id="1" name=""/>
+                    <pic:cNvPicPr/>
+                  </pic:nvPicPr>
+                  <pic:blipFill>
+                    <a:blip r:embed="rId9"/>
+                    <a:stretch>
+                      <a:fillRect/>
+                    </a:stretch>
+                  </pic:blipFill>
+                  <pic:spPr>
+                    <a:xfrm>
+                      <a:off x="0" y="0"/>
+                      <a:ext cx="2994330" cy="1712036"/>
+                    </a:xfrm>
+                    <a:prstGeom prst="rect">
+                      <a:avLst/>
+                    </a:prstGeom>
+                  </pic:spPr>
+                </pic:pic>
+              </a:graphicData>
+            </a:graphic>
+          </wp:inline>
+        </w:drawing>
+      </w:r>
+    </w:p>
+    <w:p>
+      <w:pPr>
+        <w:jc w:val="center"/>
+        <w:rPr>
+          <w:rFonts w:ascii="Comic Sans MS" w:hAnsi="Comic Sans MS"/>
+          <w:color w:val="538135" w:themeColor="accent6" w:themeShade="BF"/>
+          <w:sz w:val="32"/>
+          <w:szCs w:val="32"/>
+        </w:rPr>
+      </w:pPr>
+      <w:r>
+        <w:rPr>
+          <w:rFonts w:ascii="Comic Sans MS" w:hAnsi="Comic Sans MS"/>
+          <w:color w:val="538135" w:themeColor="accent6" w:themeShade="BF"/>
+          <w:sz w:val="32"/>
+          <w:szCs w:val="32"/>
+        </w:rPr>
+        <w:t>Dodaj odpowiedni tekst alternatywny przedstawiający zawartość obrazka i/lub funkcję linku.</w:t>
+      </w:r>
+    </w:p>
+    <w:p>
+      <w:pPr>
+        <w:jc w:val="center"/>
+        <w:rPr>
+          <w:rFonts w:ascii="Comic Sans MS" w:hAnsi="Comic Sans MS"/>
+          <w:color w:val="538135" w:themeColor="accent6" w:themeShade="BF"/>
+          <w:sz w:val="32"/>
+          <w:szCs w:val="32"/>
+        </w:rPr>
+      </w:pPr>
+    </w:p>
+    <w:p>
+      <w:pPr>
+        <w:pStyle w:val="Akapitzlist"/>
+        <w:numPr>
+          <w:ilvl w:val="0"/>
+          <w:numId w:val="2"/>
+        </w:numPr>
+        <w:jc w:val="center"/>
+        <w:rPr>
+          <w:rFonts w:ascii="Comic Sans MS" w:hAnsi="Comic Sans MS"/>
+          <w:sz w:val="32"/>
+          <w:szCs w:val="32"/>
+        </w:rPr>
+      </w:pPr>
+      <w:r>
+        <w:rPr>
+          <w:rFonts w:ascii="Comic Sans MS" w:hAnsi="Comic Sans MS"/>
+          <w:sz w:val="28"/>
+          <w:szCs w:val="28"/>
+        </w:rPr>
+        <w:t>Błędy kontrastu</w:t>
+      </w:r>
+    </w:p>
+    <w:p>
+      <w:pPr>
+        <w:pStyle w:val="Akapitzlist"/>
+        <w:jc w:val="center"/>
+        <w:rPr>
+          <w:rFonts w:ascii="Comic Sans MS" w:hAnsi="Comic Sans MS" w:cs="Noto Sans"/>
+          <w:color w:val="FF0000"/>
+          <w:sz w:val="24"/>
+          <w:szCs w:val="24"/>
+          <w:shd w:val="clear" w:color="auto" w:fill="FFFFFF"/>
+        </w:rPr>
+      </w:pPr>
+      <w:r>
+        <w:rPr>
+          <w:rFonts w:ascii="Comic Sans MS" w:hAnsi="Comic Sans MS"/>
+          <w:color w:val="FF0000"/>
+          <w:sz w:val="24"/>
+          <w:szCs w:val="24"/>
+        </w:rPr>
+        <w:t xml:space="preserve">WCAG (1.4.3) </w:t>
+      </w:r>
+      <w:r>
+        <w:rPr>
+          <w:rFonts w:ascii="Comic Sans MS" w:hAnsi="Comic Sans MS" w:cs="Noto Sans"/>
+          <w:color w:val="FF0000"/>
+          <w:sz w:val="24"/>
+          <w:szCs w:val="24"/>
+          <w:shd w:val="clear" w:color="auto" w:fill="FFFFFF"/>
+        </w:rPr>
+        <w:t>Wizualna prezentacja tekstu lub obrazu tekstu posiada współczynnik kontrastu wynoszący przynajmniej 4.5:1</w:t>
+      </w:r>
+    </w:p>
+    <w:p>
+      <w:pPr>
+        <w:pStyle w:val="Akapitzlist"/>
+        <w:jc w:val="center"/>
+        <w:rPr>
+          <w:rFonts w:ascii="Comic Sans MS" w:hAnsi="Comic Sans MS"/>
+          <w:color w:val="FF0000"/>
+          <w:sz w:val="24"/>
+          <w:szCs w:val="24"/>
+        </w:rPr>
+      </w:pPr>
+      <w:r>
+        <w:rPr>
+          <w:rFonts w:ascii="Comic Sans MS" w:hAnsi="Comic Sans MS"/>
+          <w:color w:val="538135" w:themeColor="accent6" w:themeShade="BF"/>
+          <w:sz w:val="32"/>
+          <w:szCs w:val="32"/>
+        </w:rPr>
+        <w:drawing>
+          <wp:inline distT="0" distB="0" distL="0" distR="0" wp14:anchorId="2FEC3D3B" wp14:editId="5C1FBF4F">
+            <wp:extent cx="2465223" cy="2073439"/>
+            <wp:effectExtent l="0" t="0" r="0" b="3175"/>
+            <wp:docPr id="7" name="Obraz 7"/>
+            <wp:cNvGraphicFramePr>
+              <a:graphicFrameLocks xmlns:a="http://schemas.openxmlformats.org/drawingml/2006/main" noChangeAspect="1"/>
+            </wp:cNvGraphicFramePr>
+            <a:graphic xmlns:a="http://schemas.openxmlformats.org/drawingml/2006/main">
+              <a:graphicData uri="http://schemas.openxmlformats.org/drawingml/2006/picture">
+                <pic:pic xmlns:pic="http://schemas.openxmlformats.org/drawingml/2006/picture">
+                  <pic:nvPicPr>
+                    <pic:cNvPr id="1" name=""/>
+                    <pic:cNvPicPr/>
+                  </pic:nvPicPr>
+                  <pic:blipFill>
+                    <a:blip r:embed="rId10"/>
+                    <a:stretch>
+                      <a:fillRect/>
+                    </a:stretch>
+                  </pic:blipFill>
+                  <pic:spPr>
+                    <a:xfrm>
+                      <a:off x="0" y="0"/>
+                      <a:ext cx="2474955" cy="2081625"/>
+                    </a:xfrm>
+                    <a:prstGeom prst="rect">
+                      <a:avLst/>
+                    </a:prstGeom>
+                  </pic:spPr>
+                </pic:pic>
+              </a:graphicData>
+            </a:graphic>
+          </wp:inline>
+        </w:drawing>
+      </w:r>
+    </w:p>
+    <w:p>
+      <w:pPr>
+        <w:pStyle w:val="Akapitzlist"/>
+        <w:jc w:val="center"/>
+        <w:rPr>
+          <w:rFonts w:ascii="Comic Sans MS" w:hAnsi="Comic Sans MS"/>
+          <w:color w:val="538135" w:themeColor="accent6" w:themeShade="BF"/>
+          <w:sz w:val="32"/>
+          <w:szCs w:val="32"/>
+        </w:rPr>
+      </w:pPr>
+      <w:r>
+        <w:rPr>
+          <w:rFonts w:ascii="Comic Sans MS" w:hAnsi="Comic Sans MS"/>
+          <w:color w:val="538135" w:themeColor="accent6" w:themeShade="BF"/>
+          <w:sz w:val="32"/>
+          <w:szCs w:val="32"/>
+        </w:rPr>
+        <w:t>Zwiększ kontrast między kolorem pierwszego planu (tekstu) a kolorem tła. Duży tekst (większy niż 18 punktów lub 14 punktów pogrubienia) nie wymaga tak dużego kontrastu jak mniejszy tekst.</w:t>
+      </w:r>
+    </w:p>
+    <w:p>
+      <w:pPr>
+        <w:pStyle w:val="Akapitzlist"/>
+        <w:numPr>
+          <w:ilvl w:val="0"/>
+          <w:numId w:val="2"/>
+        </w:numPr>
+        <w:jc w:val="center"/>
+        <w:rPr>
+          <w:rFonts w:ascii="Comic Sans MS" w:hAnsi="Comic Sans MS"/>
+          <w:color w:val="000000" w:themeColor="text1"/>
+          <w:sz w:val="32"/>
+          <w:szCs w:val="32"/>
+        </w:rPr>
+      </w:pPr>
+      <w:r>
+        <w:rPr>
+          <w:rFonts w:ascii="Comic Sans MS" w:hAnsi="Comic Sans MS"/>
+          <w:color w:val="000000" w:themeColor="text1"/>
+          <w:sz w:val="32"/>
+          <w:szCs w:val="32"/>
+        </w:rPr>
+        <w:lastRenderedPageBreak/>
+        <w:t>Nadmiarowy link</w:t>
+      </w:r>
+    </w:p>
+    <w:p>
+      <w:pPr>
+        <w:ind w:left="360"/>
+        <w:jc w:val="center"/>
+        <w:rPr>
+          <w:rFonts w:ascii="Comic Sans MS" w:hAnsi="Comic Sans MS" w:cs="Noto Sans"/>
+          <w:color w:val="FF0000"/>
+          <w:sz w:val="24"/>
+          <w:szCs w:val="24"/>
+          <w:shd w:val="clear" w:color="auto" w:fill="FFFFFF"/>
+        </w:rPr>
+      </w:pPr>
+      <w:r>
+        <w:rPr>
+          <w:rFonts w:ascii="Comic Sans MS" w:hAnsi="Comic Sans MS"/>
+          <w:color w:val="FF0000"/>
+          <w:sz w:val="24"/>
+          <w:szCs w:val="24"/>
+        </w:rPr>
+        <w:t xml:space="preserve">WCAG </w:t>
+      </w:r>
+      <w:r>
+        <w:rPr>
+          <w:rFonts w:ascii="Comic Sans MS" w:hAnsi="Comic Sans MS"/>
+          <w:color w:val="FF0000"/>
+          <w:sz w:val="24"/>
+          <w:szCs w:val="24"/>
+        </w:rPr>
+        <w:t>(2.2.4</w:t>
+      </w:r>
+      <w:r>
+        <w:rPr>
+          <w:rFonts w:ascii="Comic Sans MS" w:hAnsi="Comic Sans MS"/>
+          <w:color w:val="FF0000"/>
+          <w:sz w:val="24"/>
+          <w:szCs w:val="24"/>
+        </w:rPr>
+        <w:t xml:space="preserve">) </w:t>
+      </w:r>
+      <w:r>
+        <w:rPr>
+          <w:rFonts w:ascii="Comic Sans MS" w:hAnsi="Comic Sans MS"/>
+          <w:color w:val="FF0000"/>
+          <w:sz w:val="24"/>
+          <w:szCs w:val="24"/>
+          <w:shd w:val="clear" w:color="auto" w:fill="FFFFFF"/>
+        </w:rPr>
+        <w:t>Przerywanie pracy może być odłożone w czasie lub odrzucone przez użytkownika, chyba że jest to sytuacja wyjątkowa.</w:t>
+      </w:r>
+    </w:p>
+    <w:p>
+      <w:pPr>
+        <w:ind w:left="360"/>
+        <w:jc w:val="center"/>
+        <w:rPr>
+          <w:rFonts w:ascii="Comic Sans MS" w:hAnsi="Comic Sans MS"/>
+          <w:color w:val="538135" w:themeColor="accent6" w:themeShade="BF"/>
+          <w:sz w:val="32"/>
+          <w:szCs w:val="32"/>
+        </w:rPr>
+      </w:pPr>
+      <w:r>
+        <w:rPr>
+          <w:rFonts w:ascii="Comic Sans MS" w:hAnsi="Comic Sans MS"/>
+          <w:color w:val="538135" w:themeColor="accent6" w:themeShade="BF"/>
+          <w:sz w:val="32"/>
+          <w:szCs w:val="32"/>
+        </w:rPr>
+        <w:drawing>
+          <wp:inline distT="0" distB="0" distL="0" distR="0" wp14:anchorId="29061FD6" wp14:editId="6B0013D4">
+            <wp:extent cx="3905795" cy="2172003"/>
+            <wp:effectExtent l="0" t="0" r="0" b="0"/>
+            <wp:docPr id="10" name="Obraz 10"/>
+            <wp:cNvGraphicFramePr>
+              <a:graphicFrameLocks xmlns:a="http://schemas.openxmlformats.org/drawingml/2006/main" noChangeAspect="1"/>
+            </wp:cNvGraphicFramePr>
+            <a:graphic xmlns:a="http://schemas.openxmlformats.org/drawingml/2006/main">
+              <a:graphicData uri="http://schemas.openxmlformats.org/drawingml/2006/picture">
+                <pic:pic xmlns:pic="http://schemas.openxmlformats.org/drawingml/2006/picture">
+                  <pic:nvPicPr>
+                    <pic:cNvPr id="1" name=""/>
+                    <pic:cNvPicPr/>
+                  </pic:nvPicPr>
+                  <pic:blipFill>
+                    <a:blip r:embed="rId11"/>
+                    <a:stretch>
+                      <a:fillRect/>
+                    </a:stretch>
+                  </pic:blipFill>
+                  <pic:spPr>
+                    <a:xfrm>
+                      <a:off x="0" y="0"/>
+                      <a:ext cx="3905795" cy="2172003"/>
+                    </a:xfrm>
+                    <a:prstGeom prst="rect">
+                      <a:avLst/>
+                    </a:prstGeom>
+                  </pic:spPr>
+                </pic:pic>
+              </a:graphicData>
+            </a:graphic>
+          </wp:inline>
+        </w:drawing>
+      </w:r>
+    </w:p>
+    <w:p>
+      <w:pPr>
+        <w:pStyle w:val="Akapitzlist"/>
+        <w:jc w:val="center"/>
+        <w:rPr>
+          <w:rFonts w:ascii="Comic Sans MS" w:hAnsi="Comic Sans MS"/>
+          <w:color w:val="538135" w:themeColor="accent6" w:themeShade="BF"/>
+          <w:sz w:val="32"/>
+          <w:szCs w:val="32"/>
+        </w:rPr>
+      </w:pPr>
+      <w:r>
+        <w:rPr>
+          <w:rFonts w:ascii="Comic Sans MS" w:hAnsi="Comic Sans MS"/>
+          <w:color w:val="538135" w:themeColor="accent6" w:themeShade="BF"/>
+          <w:sz w:val="32"/>
+          <w:szCs w:val="32"/>
+        </w:rPr>
+        <w:t>Jeśli to możliwe, połącz nadmiarowe linki w jeden link i usuń zbędny tekst lub tekst alternatywny</w:t>
+      </w:r>
+    </w:p>
+    <w:p>
+      <w:pPr>
+        <w:pStyle w:val="Akapitzlist"/>
+        <w:jc w:val="center"/>
+        <w:rPr>
+          <w:rFonts w:ascii="Comic Sans MS" w:hAnsi="Comic Sans MS"/>
+          <w:color w:val="538135" w:themeColor="accent6" w:themeShade="BF"/>
+          <w:sz w:val="32"/>
+          <w:szCs w:val="32"/>
+        </w:rPr>
+      </w:pPr>
+    </w:p>
+    <w:p>
+      <w:pPr>
+        <w:pStyle w:val="Akapitzlist"/>
+        <w:jc w:val="center"/>
+        <w:rPr>
+          <w:rFonts w:ascii="Comic Sans MS" w:hAnsi="Comic Sans MS"/>
+          <w:color w:val="538135" w:themeColor="accent6" w:themeShade="BF"/>
+          <w:sz w:val="32"/>
+          <w:szCs w:val="32"/>
+        </w:rPr>
+      </w:pPr>
+    </w:p>
+    <w:p>
+      <w:pPr>
+        <w:pStyle w:val="Akapitzlist"/>
+        <w:numPr>
+          <w:ilvl w:val="0"/>
+          <w:numId w:val="2"/>
+        </w:numPr>
+        <w:jc w:val="center"/>
+        <w:rPr>
+          <w:rFonts w:ascii="Comic Sans MS" w:hAnsi="Comic Sans MS"/>
+          <w:color w:val="000000" w:themeColor="text1"/>
+          <w:sz w:val="32"/>
+          <w:szCs w:val="32"/>
+        </w:rPr>
+      </w:pPr>
+      <w:r>
+        <w:rPr>
+          <w:rFonts w:ascii="Comic Sans MS" w:hAnsi="Comic Sans MS"/>
+          <w:color w:val="000000" w:themeColor="text1"/>
+          <w:sz w:val="32"/>
+          <w:szCs w:val="32"/>
+        </w:rPr>
+        <w:t>Pominięty poziom nagłówka</w:t>
+      </w:r>
+    </w:p>
+    <w:p>
+      <w:pPr>
+        <w:pStyle w:val="Akapitzlist"/>
+        <w:jc w:val="center"/>
+        <w:rPr>
+          <w:rFonts w:ascii="Comic Sans MS" w:hAnsi="Comic Sans MS"/>
+          <w:color w:val="FF0000"/>
+          <w:sz w:val="24"/>
+          <w:szCs w:val="24"/>
+        </w:rPr>
+      </w:pPr>
+      <w:r>
+        <w:rPr>
+          <w:rFonts w:ascii="Comic Sans MS" w:hAnsi="Comic Sans MS"/>
+          <w:color w:val="FF0000"/>
+          <w:sz w:val="24"/>
+          <w:szCs w:val="24"/>
+        </w:rPr>
+        <w:t xml:space="preserve">WCAG (1.3.1) </w:t>
+      </w:r>
+      <w:r>
+        <w:rPr>
+          <w:rFonts w:ascii="Comic Sans MS" w:hAnsi="Comic Sans MS" w:cs="Noto Sans"/>
+          <w:color w:val="FF0000"/>
+          <w:sz w:val="24"/>
+          <w:szCs w:val="24"/>
+          <w:shd w:val="clear" w:color="auto" w:fill="FFFFFF"/>
+        </w:rPr>
+        <w:t>Informacje, struktura oraz relacje między treściami przekazywane poprzez prezentację mogą być odczytane przez program komputerowy lub istnieją w postaci tekstu.</w:t>
+      </w:r>
+    </w:p>
+    <w:p>
+      <w:pPr>
+        <w:ind w:left="360"/>
+        <w:jc w:val="center"/>
+        <w:rPr>
+          <w:rFonts w:ascii="Comic Sans MS" w:hAnsi="Comic Sans MS"/>
+          <w:color w:val="538135" w:themeColor="accent6" w:themeShade="BF"/>
+          <w:sz w:val="32"/>
+          <w:szCs w:val="32"/>
+        </w:rPr>
+      </w:pPr>
+      <w:r>
+        <w:rPr>
+          <w:rFonts w:ascii="Comic Sans MS" w:hAnsi="Comic Sans MS"/>
+          <w:color w:val="538135" w:themeColor="accent6" w:themeShade="BF"/>
+          <w:sz w:val="32"/>
+          <w:szCs w:val="32"/>
+        </w:rPr>
+        <w:drawing>
+          <wp:inline distT="0" distB="0" distL="0" distR="0" wp14:anchorId="09627106" wp14:editId="2096AB3A">
+            <wp:extent cx="2857899" cy="2524477"/>
+            <wp:effectExtent l="0" t="0" r="0" b="9525"/>
+            <wp:docPr id="11" name="Obraz 11"/>
+            <wp:cNvGraphicFramePr>
+              <a:graphicFrameLocks xmlns:a="http://schemas.openxmlformats.org/drawingml/2006/main" noChangeAspect="1"/>
+            </wp:cNvGraphicFramePr>
+            <a:graphic xmlns:a="http://schemas.openxmlformats.org/drawingml/2006/main">
+              <a:graphicData uri="http://schemas.openxmlformats.org/drawingml/2006/picture">
+                <pic:pic xmlns:pic="http://schemas.openxmlformats.org/drawingml/2006/picture">
+                  <pic:nvPicPr>
+                    <pic:cNvPr id="1" name=""/>
+                    <pic:cNvPicPr/>
+                  </pic:nvPicPr>
+                  <pic:blipFill>
+                    <a:blip r:embed="rId12"/>
+                    <a:stretch>
+                      <a:fillRect/>
+                    </a:stretch>
+                  </pic:blipFill>
+                  <pic:spPr>
+                    <a:xfrm>
+                      <a:off x="0" y="0"/>
+                      <a:ext cx="2857899" cy="2524477"/>
+                    </a:xfrm>
+                    <a:prstGeom prst="rect">
+                      <a:avLst/>
+                    </a:prstGeom>
+                  </pic:spPr>
+                </pic:pic>
+              </a:graphicData>
+            </a:graphic>
+          </wp:inline>
+        </w:drawing>
+      </w:r>
+    </w:p>
+    <w:p>
+      <w:pPr>
+        <w:ind w:left="360"/>
+        <w:jc w:val="center"/>
+        <w:rPr>
+          <w:rFonts w:ascii="Comic Sans MS" w:hAnsi="Comic Sans MS"/>
+          <w:color w:val="538135" w:themeColor="accent6" w:themeShade="BF"/>
+          <w:sz w:val="32"/>
+          <w:szCs w:val="32"/>
+        </w:rPr>
+      </w:pPr>
+      <w:r>
+        <w:rPr>
+          <w:rFonts w:ascii="Comic Sans MS" w:hAnsi="Comic Sans MS"/>
+          <w:color w:val="538135" w:themeColor="accent6" w:themeShade="BF"/>
+          <w:sz w:val="32"/>
+          <w:szCs w:val="32"/>
+        </w:rPr>
+        <w:t>Zmień strukturę nagłówków dokumentów, aby upewnić się, że poziomy nagłówków nie są pomijane.</w:t>
+      </w:r>
     </w:p>
     <w:sectPr>
       <w:pgSz w:w="11906" w:h="16838"/>
@@ -711,8 +1597,8 @@
   <w:abstractNum w:abstractNumId="0" w15:restartNumberingAfterBreak="0">
     <w:nsid w:val="368A79A1"/>
     <w:multiLevelType w:val="hybridMultilevel"/>
-    <w:tmpl w:val="23E6B776"/>
-    <w:lvl w:ilvl="0" w:tplc="401AAF78">
+    <w:tmpl w:val="B5ACFBAE"/>
+    <w:lvl w:ilvl="0" w:tplc="83D8943E">
       <w:start w:val="1"/>
       <w:numFmt w:val="decimal"/>
       <w:lvlText w:val="%1."/>
@@ -722,7 +1608,7 @@
       </w:pPr>
       <w:rPr>
         <w:rFonts w:cstheme="minorBidi" w:hint="default"/>
-        <w:color w:val="auto"/>
+        <w:color w:val="000000" w:themeColor="text1"/>
         <w:sz w:val="32"/>
       </w:rPr>
     </w:lvl>
@@ -799,8 +1685,196 @@
       </w:pPr>
     </w:lvl>
   </w:abstractNum>
+  <w:abstractNum w:abstractNumId="1" w15:restartNumberingAfterBreak="0">
+    <w:nsid w:val="3D91355E"/>
+    <w:multiLevelType w:val="hybridMultilevel"/>
+    <w:tmpl w:val="B5ACFBAE"/>
+    <w:lvl w:ilvl="0" w:tplc="83D8943E">
+      <w:start w:val="1"/>
+      <w:numFmt w:val="decimal"/>
+      <w:lvlText w:val="%1."/>
+      <w:lvlJc w:val="left"/>
+      <w:pPr>
+        <w:ind w:left="720" w:hanging="360"/>
+      </w:pPr>
+      <w:rPr>
+        <w:rFonts w:cstheme="minorBidi" w:hint="default"/>
+        <w:color w:val="000000" w:themeColor="text1"/>
+        <w:sz w:val="32"/>
+      </w:rPr>
+    </w:lvl>
+    <w:lvl w:ilvl="1" w:tplc="04150019" w:tentative="1">
+      <w:start w:val="1"/>
+      <w:numFmt w:val="lowerLetter"/>
+      <w:lvlText w:val="%2."/>
+      <w:lvlJc w:val="left"/>
+      <w:pPr>
+        <w:ind w:left="1440" w:hanging="360"/>
+      </w:pPr>
+    </w:lvl>
+    <w:lvl w:ilvl="2" w:tplc="0415001B" w:tentative="1">
+      <w:start w:val="1"/>
+      <w:numFmt w:val="lowerRoman"/>
+      <w:lvlText w:val="%3."/>
+      <w:lvlJc w:val="right"/>
+      <w:pPr>
+        <w:ind w:left="2160" w:hanging="180"/>
+      </w:pPr>
+    </w:lvl>
+    <w:lvl w:ilvl="3" w:tplc="0415000F" w:tentative="1">
+      <w:start w:val="1"/>
+      <w:numFmt w:val="decimal"/>
+      <w:lvlText w:val="%4."/>
+      <w:lvlJc w:val="left"/>
+      <w:pPr>
+        <w:ind w:left="2880" w:hanging="360"/>
+      </w:pPr>
+    </w:lvl>
+    <w:lvl w:ilvl="4" w:tplc="04150019" w:tentative="1">
+      <w:start w:val="1"/>
+      <w:numFmt w:val="lowerLetter"/>
+      <w:lvlText w:val="%5."/>
+      <w:lvlJc w:val="left"/>
+      <w:pPr>
+        <w:ind w:left="3600" w:hanging="360"/>
+      </w:pPr>
+    </w:lvl>
+    <w:lvl w:ilvl="5" w:tplc="0415001B" w:tentative="1">
+      <w:start w:val="1"/>
+      <w:numFmt w:val="lowerRoman"/>
+      <w:lvlText w:val="%6."/>
+      <w:lvlJc w:val="right"/>
+      <w:pPr>
+        <w:ind w:left="4320" w:hanging="180"/>
+      </w:pPr>
+    </w:lvl>
+    <w:lvl w:ilvl="6" w:tplc="0415000F" w:tentative="1">
+      <w:start w:val="1"/>
+      <w:numFmt w:val="decimal"/>
+      <w:lvlText w:val="%7."/>
+      <w:lvlJc w:val="left"/>
+      <w:pPr>
+        <w:ind w:left="5040" w:hanging="360"/>
+      </w:pPr>
+    </w:lvl>
+    <w:lvl w:ilvl="7" w:tplc="04150019" w:tentative="1">
+      <w:start w:val="1"/>
+      <w:numFmt w:val="lowerLetter"/>
+      <w:lvlText w:val="%8."/>
+      <w:lvlJc w:val="left"/>
+      <w:pPr>
+        <w:ind w:left="5760" w:hanging="360"/>
+      </w:pPr>
+    </w:lvl>
+    <w:lvl w:ilvl="8" w:tplc="0415001B" w:tentative="1">
+      <w:start w:val="1"/>
+      <w:numFmt w:val="lowerRoman"/>
+      <w:lvlText w:val="%9."/>
+      <w:lvlJc w:val="right"/>
+      <w:pPr>
+        <w:ind w:left="6480" w:hanging="180"/>
+      </w:pPr>
+    </w:lvl>
+  </w:abstractNum>
+  <w:abstractNum w:abstractNumId="2" w15:restartNumberingAfterBreak="0">
+    <w:nsid w:val="4C4B2F28"/>
+    <w:multiLevelType w:val="hybridMultilevel"/>
+    <w:tmpl w:val="B5ACFBAE"/>
+    <w:lvl w:ilvl="0" w:tplc="83D8943E">
+      <w:start w:val="1"/>
+      <w:numFmt w:val="decimal"/>
+      <w:lvlText w:val="%1."/>
+      <w:lvlJc w:val="left"/>
+      <w:pPr>
+        <w:ind w:left="720" w:hanging="360"/>
+      </w:pPr>
+      <w:rPr>
+        <w:rFonts w:cstheme="minorBidi" w:hint="default"/>
+        <w:color w:val="000000" w:themeColor="text1"/>
+        <w:sz w:val="32"/>
+      </w:rPr>
+    </w:lvl>
+    <w:lvl w:ilvl="1" w:tplc="04150019" w:tentative="1">
+      <w:start w:val="1"/>
+      <w:numFmt w:val="lowerLetter"/>
+      <w:lvlText w:val="%2."/>
+      <w:lvlJc w:val="left"/>
+      <w:pPr>
+        <w:ind w:left="1440" w:hanging="360"/>
+      </w:pPr>
+    </w:lvl>
+    <w:lvl w:ilvl="2" w:tplc="0415001B" w:tentative="1">
+      <w:start w:val="1"/>
+      <w:numFmt w:val="lowerRoman"/>
+      <w:lvlText w:val="%3."/>
+      <w:lvlJc w:val="right"/>
+      <w:pPr>
+        <w:ind w:left="2160" w:hanging="180"/>
+      </w:pPr>
+    </w:lvl>
+    <w:lvl w:ilvl="3" w:tplc="0415000F" w:tentative="1">
+      <w:start w:val="1"/>
+      <w:numFmt w:val="decimal"/>
+      <w:lvlText w:val="%4."/>
+      <w:lvlJc w:val="left"/>
+      <w:pPr>
+        <w:ind w:left="2880" w:hanging="360"/>
+      </w:pPr>
+    </w:lvl>
+    <w:lvl w:ilvl="4" w:tplc="04150019" w:tentative="1">
+      <w:start w:val="1"/>
+      <w:numFmt w:val="lowerLetter"/>
+      <w:lvlText w:val="%5."/>
+      <w:lvlJc w:val="left"/>
+      <w:pPr>
+        <w:ind w:left="3600" w:hanging="360"/>
+      </w:pPr>
+    </w:lvl>
+    <w:lvl w:ilvl="5" w:tplc="0415001B" w:tentative="1">
+      <w:start w:val="1"/>
+      <w:numFmt w:val="lowerRoman"/>
+      <w:lvlText w:val="%6."/>
+      <w:lvlJc w:val="right"/>
+      <w:pPr>
+        <w:ind w:left="4320" w:hanging="180"/>
+      </w:pPr>
+    </w:lvl>
+    <w:lvl w:ilvl="6" w:tplc="0415000F" w:tentative="1">
+      <w:start w:val="1"/>
+      <w:numFmt w:val="decimal"/>
+      <w:lvlText w:val="%7."/>
+      <w:lvlJc w:val="left"/>
+      <w:pPr>
+        <w:ind w:left="5040" w:hanging="360"/>
+      </w:pPr>
+    </w:lvl>
+    <w:lvl w:ilvl="7" w:tplc="04150019" w:tentative="1">
+      <w:start w:val="1"/>
+      <w:numFmt w:val="lowerLetter"/>
+      <w:lvlText w:val="%8."/>
+      <w:lvlJc w:val="left"/>
+      <w:pPr>
+        <w:ind w:left="5760" w:hanging="360"/>
+      </w:pPr>
+    </w:lvl>
+    <w:lvl w:ilvl="8" w:tplc="0415001B" w:tentative="1">
+      <w:start w:val="1"/>
+      <w:numFmt w:val="lowerRoman"/>
+      <w:lvlText w:val="%9."/>
+      <w:lvlJc w:val="right"/>
+      <w:pPr>
+        <w:ind w:left="6480" w:hanging="180"/>
+      </w:pPr>
+    </w:lvl>
+  </w:abstractNum>
   <w:num w:numId="1">
     <w:abstractNumId w:val="0"/>
+  </w:num>
+  <w:num w:numId="2">
+    <w:abstractNumId w:val="2"/>
+  </w:num>
+  <w:num w:numId="3">
+    <w:abstractNumId w:val="1"/>
   </w:num>
 </w:numbering>
 </file>

</xml_diff>